<commit_message>
docs: update Word report with live Railway deployment links
</commit_message>
<xml_diff>
--- a/LeadPilot_Technical_Assessment_Report.docx
+++ b/LeadPilot_Technical_Assessment_Report.docx
@@ -88,6 +88,59 @@
                 <w:sz w:val="20"/>
               </w:rPr>
               <w:t>Rudraksh Singh (Technical Assessment Submission)</w:t>
+            </w:r>
+          </w:p>
+        </w:tc>
+      </w:tr>
+      <w:tr>
+        <w:tc>
+          <w:tcPr>
+            <w:tcW w:type="dxa" w:w="3168"/>
+            <w:shd w:fill="F1F5F9"/>
+            <w:tcMar>
+              <w:top w:w="100" w:type="dxa"/>
+              <w:bottom w:w="100" w:type="dxa"/>
+              <w:left w:w="140" w:type="dxa"/>
+              <w:right w:w="140" w:type="dxa"/>
+            </w:tcMar>
+          </w:tcPr>
+          <w:p>
+            <w:pPr>
+              <w:spacing w:before="40" w:after="40"/>
+            </w:pPr>
+            <w:r>
+              <w:rPr>
+                <w:b/>
+                <w:color w:val="334155"/>
+                <w:sz w:val="20"/>
+              </w:rPr>
+              <w:t>Live Cloud URL (Railway):</w:t>
+            </w:r>
+          </w:p>
+        </w:tc>
+        <w:tc>
+          <w:tcPr>
+            <w:tcW w:type="dxa" w:w="6624"/>
+            <w:shd w:fill="F8FAFC"/>
+            <w:tcMar>
+              <w:top w:w="100" w:type="dxa"/>
+              <w:bottom w:w="100" w:type="dxa"/>
+              <w:left w:w="140" w:type="dxa"/>
+              <w:right w:w="140" w:type="dxa"/>
+            </w:tcMar>
+          </w:tcPr>
+          <w:p>
+            <w:pPr>
+              <w:spacing w:before="40" w:after="40"/>
+            </w:pPr>
+            <w:r>
+              <w:rPr>
+                <w:color w:val="0F172A"/>
+                <w:sz w:val="20"/>
+              </w:rPr>
+              <w:t>Web App: https://leadpilot-frontend-production-fdd7.up.railway.app</w:t>
+              <w:br/>
+              <w:t>API Docs: https://leadpilot-backend-production-ead0.up.railway.app/docs</w:t>
             </w:r>
           </w:p>
         </w:tc>

</xml_diff>